<commit_message>
amend/correct results of previous release
</commit_message>
<xml_diff>
--- a/Documentation/Checklist_Release_VECTO_3.2.0.925.docx
+++ b/Documentation/Checklist_Release_VECTO_3.2.0.925.docx
@@ -2919,7 +2919,7 @@
                 <w:rFonts w:ascii="Arial" w:hAnsi="Arial" w:cs="Arial"/>
                 <w:noProof/>
               </w:rPr>
-              <w:t>20.885</w:t>
+              <w:t>20.7688</w:t>
             </w:r>
             <w:r>
               <w:rPr>
@@ -3109,7 +3109,7 @@
                 <w:rFonts w:ascii="Arial" w:hAnsi="Arial" w:cs="Arial"/>
                 <w:noProof/>
               </w:rPr>
-              <w:t>36.3718</w:t>
+              <w:t>36.9063</w:t>
             </w:r>
             <w:r>
               <w:rPr>
@@ -4125,7 +4125,16 @@
                 <w:rFonts w:ascii="Arial" w:hAnsi="Arial" w:cs="Arial"/>
                 <w:noProof/>
               </w:rPr>
-              <w:t>3420.5478</w:t>
+              <w:t>342</w:t>
+            </w:r>
+            <w:bookmarkStart w:id="10" w:name="_GoBack"/>
+            <w:bookmarkEnd w:id="10"/>
+            <w:r>
+              <w:rPr>
+                <w:rFonts w:ascii="Arial" w:hAnsi="Arial" w:cs="Arial"/>
+                <w:noProof/>
+              </w:rPr>
+              <w:t>0.5478</w:t>
             </w:r>
             <w:r>
               <w:rPr>
@@ -4304,7 +4313,7 @@
                 <w:b/>
               </w:rPr>
             </w:pPr>
-            <w:bookmarkStart w:id="10" w:name="_Hlk472520743"/>
+            <w:bookmarkStart w:id="11" w:name="_Hlk472520743"/>
             <w:r>
               <w:rPr>
                 <w:rFonts w:ascii="Arial" w:hAnsi="Arial" w:cs="Arial"/>
@@ -4442,7 +4451,7 @@
           </w:sdtContent>
         </w:sdt>
       </w:tr>
-      <w:bookmarkEnd w:id="10"/>
+      <w:bookmarkEnd w:id="11"/>
       <w:tr>
         <w:tc>
           <w:tcPr>
@@ -5311,7 +5320,7 @@
           </w:ffData>
         </w:fldChar>
       </w:r>
-      <w:bookmarkStart w:id="11" w:name="Text4"/>
+      <w:bookmarkStart w:id="12" w:name="Text4"/>
       <w:r>
         <w:rPr>
           <w:sz w:val="24"/>
@@ -5342,7 +5351,7 @@
         </w:rPr>
         <w:fldChar w:fldCharType="end"/>
       </w:r>
-      <w:bookmarkEnd w:id="11"/>
+      <w:bookmarkEnd w:id="12"/>
     </w:p>
     <w:p>
       <w:pPr>
@@ -5378,7 +5387,7 @@
           </w:ffData>
         </w:fldChar>
       </w:r>
-      <w:bookmarkStart w:id="12" w:name="Text5"/>
+      <w:bookmarkStart w:id="13" w:name="Text5"/>
       <w:r>
         <w:rPr>
           <w:sz w:val="24"/>
@@ -5409,7 +5418,7 @@
         </w:rPr>
         <w:fldChar w:fldCharType="end"/>
       </w:r>
-      <w:bookmarkEnd w:id="12"/>
+      <w:bookmarkEnd w:id="13"/>
     </w:p>
     <w:sectPr>
       <w:pgSz w:w="12240" w:h="15840"/>
@@ -6669,7 +6678,7 @@
 </file>
 
 <file path=customXml/itemProps1.xml><?xml version="1.0" encoding="utf-8"?>
-<ds:datastoreItem xmlns:ds="http://schemas.openxmlformats.org/officeDocument/2006/customXml" ds:itemID="{0B2FA7F5-EE04-4FCD-9663-40A753B310E7}">
+<ds:datastoreItem xmlns:ds="http://schemas.openxmlformats.org/officeDocument/2006/customXml" ds:itemID="{53162CA9-EA09-4BF7-BD57-DDF367AC1BF4}">
   <ds:schemaRefs>
     <ds:schemaRef ds:uri="http://schemas.openxmlformats.org/officeDocument/2006/bibliography"/>
   </ds:schemaRefs>

</xml_diff>